<commit_message>
Refresh generated sample documents
</commit_message>
<xml_diff>
--- a/documentos/rh/politica-vacaciones.docx
+++ b/documentos/rh/politica-vacaciones.docx
@@ -8,11 +8,6 @@
       </w:pPr>
       <w:r>
         <w:t>Política de Vacaciones — Ponqué Ponqué Calarcá</w:t>
-      </w:r>
-    </w:p>
-    <w:p>
-      <w:r>
-        <w:t>Documento de ejemplo (datos ficticios) para el agente RAG.</w:t>
       </w:r>
     </w:p>
     <w:p>

</xml_diff>